<commit_message>
Form 3 first sequence: questions limited to the syllabus extract given by the teacher
The Earth (size, shape, proofs of sphericity), the universe and the Moon,
latitudes and longitudes, great circles; local time removed.

Co-Authored-By: Claude Opus 5.5 <noreply@anthropic.com>
Claude-Session: https://claude.ai/code/session_0115LFSb2ktGLWPeVksFkSer
</commit_message>
<xml_diff>
--- a/epreuves/2026-2027/Sequence_1/F3_Geography_Seq1_2026-2027.docx
+++ b/epreuves/2026-2027/Sequence_1/F3_Geography_Seq1_2026-2027.docx
@@ -957,7 +957,7 @@
                 <w:sz w:val="20"/>
                 <w:szCs w:val="20"/>
               </w:rPr>
-              <w:t xml:space="preserve"> Learners are able to locate places and calculate time on the Earth’s surface.</w:t>
+              <w:t xml:space="preserve"> Learners are able to describe the planet Earth and to locate places on its surface.</w:t>
             </w:r>
           </w:p>
         </w:tc>
@@ -1650,7 +1650,7 @@
                 <w:sz w:val="22"/>
                 <w:szCs w:val="22"/>
               </w:rPr>
-              <w:t xml:space="preserve">2. The line of latitude 0° is called the:</w:t>
+              <w:t xml:space="preserve">2. The natural satellite of the Earth is:</w:t>
             </w:r>
           </w:p>
           <w:p>
@@ -1664,7 +1664,7 @@
                 <w:sz w:val="22"/>
                 <w:szCs w:val="22"/>
               </w:rPr>
-              <w:t xml:space="preserve">A.  Greenwich Meridian</w:t>
+              <w:t xml:space="preserve">A.  The Sun</w:t>
             </w:r>
           </w:p>
           <w:p>
@@ -1678,7 +1678,7 @@
                 <w:sz w:val="22"/>
                 <w:szCs w:val="22"/>
               </w:rPr>
-              <w:t xml:space="preserve">B.  Equator</w:t>
+              <w:t xml:space="preserve">B.  The Moon</w:t>
             </w:r>
           </w:p>
           <w:p>
@@ -1692,7 +1692,7 @@
                 <w:sz w:val="22"/>
                 <w:szCs w:val="22"/>
               </w:rPr>
-              <w:t xml:space="preserve">C.  Tropic of Cancer</w:t>
+              <w:t xml:space="preserve">C.  Mars</w:t>
             </w:r>
           </w:p>
           <w:p>
@@ -1706,7 +1706,7 @@
                 <w:sz w:val="22"/>
                 <w:szCs w:val="22"/>
               </w:rPr>
-              <w:t xml:space="preserve">D.  International Date Line</w:t>
+              <w:t xml:space="preserve">D.  The Milky Way</w:t>
             </w:r>
           </w:p>
           <w:p>
@@ -1726,7 +1726,7 @@
                 <w:sz w:val="22"/>
                 <w:szCs w:val="22"/>
               </w:rPr>
-              <w:t xml:space="preserve">3. The line of longitude 0° is called the:</w:t>
+              <w:t xml:space="preserve">3. The phase of the Moon in which its whole lit face can be seen from the Earth is called the:</w:t>
             </w:r>
           </w:p>
           <w:p>
@@ -1740,7 +1740,7 @@
                 <w:sz w:val="22"/>
                 <w:szCs w:val="22"/>
               </w:rPr>
-              <w:t xml:space="preserve">A.  Equator</w:t>
+              <w:t xml:space="preserve">A.  New Moon</w:t>
             </w:r>
           </w:p>
           <w:p>
@@ -1754,7 +1754,7 @@
                 <w:sz w:val="22"/>
                 <w:szCs w:val="22"/>
               </w:rPr>
-              <w:t xml:space="preserve">B.  International Date Line</w:t>
+              <w:t xml:space="preserve">B.  First quarter</w:t>
             </w:r>
           </w:p>
           <w:p>
@@ -1768,7 +1768,7 @@
                 <w:sz w:val="22"/>
                 <w:szCs w:val="22"/>
               </w:rPr>
-              <w:t xml:space="preserve">C.  Greenwich (Prime) Meridian</w:t>
+              <w:t xml:space="preserve">C.  Full Moon</w:t>
             </w:r>
           </w:p>
           <w:p>
@@ -1782,7 +1782,7 @@
                 <w:sz w:val="22"/>
                 <w:szCs w:val="22"/>
               </w:rPr>
-              <w:t xml:space="preserve">D.  Arctic Circle</w:t>
+              <w:t xml:space="preserve">D.  Last quarter</w:t>
             </w:r>
           </w:p>
           <w:p>
@@ -1820,7 +1820,7 @@
                 <w:sz w:val="22"/>
                 <w:szCs w:val="22"/>
               </w:rPr>
-              <w:t xml:space="preserve">4. Which of the following is a great circle?</w:t>
+              <w:t xml:space="preserve">4. The line of longitude 0° is called the:</w:t>
             </w:r>
           </w:p>
           <w:p>
@@ -1834,7 +1834,7 @@
                 <w:sz w:val="22"/>
                 <w:szCs w:val="22"/>
               </w:rPr>
-              <w:t xml:space="preserve">A.  The Tropic of Cancer</w:t>
+              <w:t xml:space="preserve">A.  Equator</w:t>
             </w:r>
           </w:p>
           <w:p>
@@ -1848,7 +1848,7 @@
                 <w:sz w:val="22"/>
                 <w:szCs w:val="22"/>
               </w:rPr>
-              <w:t xml:space="preserve">B.  The Equator</w:t>
+              <w:t xml:space="preserve">B.  International Date Line</w:t>
             </w:r>
           </w:p>
           <w:p>
@@ -1862,7 +1862,7 @@
                 <w:sz w:val="22"/>
                 <w:szCs w:val="22"/>
               </w:rPr>
-              <w:t xml:space="preserve">C.  The Arctic Circle</w:t>
+              <w:t xml:space="preserve">C.  Greenwich (Prime) Meridian</w:t>
             </w:r>
           </w:p>
           <w:p>
@@ -1876,7 +1876,7 @@
                 <w:sz w:val="22"/>
                 <w:szCs w:val="22"/>
               </w:rPr>
-              <w:t xml:space="preserve">D.  The Tropic of Capricorn</w:t>
+              <w:t xml:space="preserve">D.  Arctic Circle</w:t>
             </w:r>
           </w:p>
           <w:p>
@@ -1896,7 +1896,7 @@
                 <w:sz w:val="22"/>
                 <w:szCs w:val="22"/>
               </w:rPr>
-              <w:t xml:space="preserve">5. The Earth turns through 360° in 24 hours. One degree of longitude therefore corresponds to a time difference of:</w:t>
+              <w:t xml:space="preserve">5. Which of the following lines is a great circle?</w:t>
             </w:r>
           </w:p>
           <w:p>
@@ -1910,7 +1910,7 @@
                 <w:sz w:val="22"/>
                 <w:szCs w:val="22"/>
               </w:rPr>
-              <w:t xml:space="preserve">A.  1 minute</w:t>
+              <w:t xml:space="preserve">A.  The Tropic of Cancer</w:t>
             </w:r>
           </w:p>
           <w:p>
@@ -1924,7 +1924,7 @@
                 <w:sz w:val="22"/>
                 <w:szCs w:val="22"/>
               </w:rPr>
-              <w:t xml:space="preserve">B.  4 minutes</w:t>
+              <w:t xml:space="preserve">B.  The Equator</w:t>
             </w:r>
           </w:p>
           <w:p>
@@ -1938,7 +1938,7 @@
                 <w:sz w:val="22"/>
                 <w:szCs w:val="22"/>
               </w:rPr>
-              <w:t xml:space="preserve">C.  15 minutes</w:t>
+              <w:t xml:space="preserve">C.  The Arctic Circle</w:t>
             </w:r>
           </w:p>
           <w:p>
@@ -1952,7 +1952,7 @@
                 <w:sz w:val="22"/>
                 <w:szCs w:val="22"/>
               </w:rPr>
-              <w:t xml:space="preserve">D.  1 hour</w:t>
+              <w:t xml:space="preserve">D.  The Tropic of Capricorn</w:t>
             </w:r>
           </w:p>
           <w:p>
@@ -1966,7 +1966,8 @@
     <w:p>
       <w:pPr>
         <w:keepNext/>
-        <w:spacing w:after="80" w:before="160"/>
+        <w:pageBreakBefore/>
+        <w:spacing w:after="80"/>
       </w:pPr>
       <w:r>
         <w:rPr>
@@ -1976,7 +1977,7 @@
           <w:sz w:val="24"/>
           <w:szCs w:val="24"/>
         </w:rPr>
-        <w:t xml:space="preserve">Section II: Calculations (2 × 2 = 4 marks)</w:t>
+        <w:t xml:space="preserve">Section II: Structural Questions (2 × 2 = 4 marks)</w:t>
       </w:r>
     </w:p>
     <w:p>
@@ -2035,7 +2036,7 @@
           <w:sz w:val="24"/>
           <w:szCs w:val="24"/>
         </w:rPr>
-        <w:t xml:space="preserve">, on the same meridian. Taking 1° = 111 km, calculate the distance between the two towns. </w:t>
+        <w:t xml:space="preserve">, on the same meridian. Taking 1° of latitude = 111 km, calculate the distance between the two towns. </w:t>
       </w:r>
       <w:r>
         <w:rPr>
@@ -2119,7 +2120,7 @@
           <w:sz w:val="24"/>
           <w:szCs w:val="24"/>
         </w:rPr>
-        <w:t xml:space="preserve"> When it is </w:t>
+        <w:t xml:space="preserve"> Give </w:t>
       </w:r>
       <w:r>
         <w:rPr>
@@ -2129,33 +2130,15 @@
           <w:sz w:val="24"/>
           <w:szCs w:val="24"/>
         </w:rPr>
-        <w:t xml:space="preserve">12:00 noon</w:t>
-      </w:r>
-      <w:r>
-        <w:rPr>
-          <w:rFonts w:ascii="Times New Roman" w:cs="Times New Roman" w:eastAsia="Times New Roman" w:hAnsi="Times New Roman"/>
-          <w:sz w:val="24"/>
-          <w:szCs w:val="24"/>
-        </w:rPr>
-        <w:t xml:space="preserve"> at Greenwich (0°), what is the local time at Garoua (longitude </w:t>
-      </w:r>
-      <w:r>
-        <w:rPr>
-          <w:rFonts w:ascii="Times New Roman" w:cs="Times New Roman" w:eastAsia="Times New Roman" w:hAnsi="Times New Roman"/>
-          <w:b/>
-          <w:bCs/>
-          <w:sz w:val="24"/>
-          <w:szCs w:val="24"/>
-        </w:rPr>
-        <w:t xml:space="preserve">13° E</w:t>
-      </w:r>
-      <w:r>
-        <w:rPr>
-          <w:rFonts w:ascii="Times New Roman" w:cs="Times New Roman" w:eastAsia="Times New Roman" w:hAnsi="Times New Roman"/>
-          <w:sz w:val="24"/>
-          <w:szCs w:val="24"/>
-        </w:rPr>
-        <w:t xml:space="preserve">)? Show your working. </w:t>
+        <w:t xml:space="preserve">two</w:t>
+      </w:r>
+      <w:r>
+        <w:rPr>
+          <w:rFonts w:ascii="Times New Roman" w:cs="Times New Roman" w:eastAsia="Times New Roman" w:hAnsi="Times New Roman"/>
+          <w:sz w:val="24"/>
+          <w:szCs w:val="24"/>
+        </w:rPr>
+        <w:t xml:space="preserve"> differences between lines of latitude and lines of longitude. </w:t>
       </w:r>
       <w:r>
         <w:rPr>
@@ -2289,7 +2272,7 @@
                 <w:sz w:val="24"/>
                 <w:szCs w:val="24"/>
               </w:rPr>
-              <w:t xml:space="preserve">Your uncle, a trader in Garoua, wants to talk on the telephone with his business partner in New York (United States of America). He calls him at 8:00 a.m., Garoua time, but his partner is angry because he has been woken up in the middle of the night. Your uncle does not understand why it is night in New York when it is morning in Garoua, and he asks you, a Form Three geography student, to help him.</w:t>
+              <w:t xml:space="preserve">During a geography lesson in Garoua, your classmate Ali says that the Earth is flat. He explains that when he looks around the town or across the Benue plain, the land looks flat, and that if the Earth were round, people living at the bottom would fall off. Some classmates believe him. Your teacher asks you, a Form Three geography student, to help the class understand the true shape of the Earth.</w:t>
             </w:r>
           </w:p>
         </w:tc>
@@ -2418,7 +2401,7 @@
           <w:sz w:val="24"/>
           <w:szCs w:val="24"/>
         </w:rPr>
-        <w:t xml:space="preserve"> Explain why it is morning in Garoua while it is still night in New York. </w:t>
+        <w:t xml:space="preserve"> Give three proofs that show that the Earth is spherical. </w:t>
       </w:r>
       <w:r>
         <w:rPr>
@@ -2429,6 +2412,20 @@
           <w:szCs w:val="24"/>
         </w:rPr>
         <w:t xml:space="preserve">(3 marks)</w:t>
+      </w:r>
+    </w:p>
+    <w:p>
+      <w:pPr>
+        <w:spacing w:after="0" w:before="0"/>
+        <w:ind w:left="360" w:hanging="0"/>
+      </w:pPr>
+      <w:r>
+        <w:rPr>
+          <w:rFonts w:ascii="Times New Roman" w:cs="Times New Roman" w:eastAsia="Times New Roman" w:hAnsi="Times New Roman"/>
+          <w:sz w:val="24"/>
+          <w:szCs w:val="24"/>
+        </w:rPr>
+        <w:t xml:space="preserve">i)</w:t>
       </w:r>
     </w:p>
     <w:p>
@@ -2450,6 +2447,20 @@
     </w:p>
     <w:p>
       <w:pPr>
+        <w:spacing w:after="0" w:before="0"/>
+        <w:ind w:left="360" w:hanging="0"/>
+      </w:pPr>
+      <w:r>
+        <w:rPr>
+          <w:rFonts w:ascii="Times New Roman" w:cs="Times New Roman" w:eastAsia="Times New Roman" w:hAnsi="Times New Roman"/>
+          <w:sz w:val="24"/>
+          <w:szCs w:val="24"/>
+        </w:rPr>
+        <w:t xml:space="preserve">ii)</w:t>
+      </w:r>
+    </w:p>
+    <w:p>
+      <w:pPr>
         <w:tabs>
           <w:tab w:val="right" w:pos="10106" w:leader="dot"/>
         </w:tabs>
@@ -2467,6 +2478,20 @@
     </w:p>
     <w:p>
       <w:pPr>
+        <w:spacing w:after="0" w:before="0"/>
+        <w:ind w:left="360" w:hanging="0"/>
+      </w:pPr>
+      <w:r>
+        <w:rPr>
+          <w:rFonts w:ascii="Times New Roman" w:cs="Times New Roman" w:eastAsia="Times New Roman" w:hAnsi="Times New Roman"/>
+          <w:sz w:val="24"/>
+          <w:szCs w:val="24"/>
+        </w:rPr>
+        <w:t xml:space="preserve">iii)</w:t>
+      </w:r>
+    </w:p>
+    <w:p>
+      <w:pPr>
         <w:tabs>
           <w:tab w:val="right" w:pos="10106" w:leader="dot"/>
         </w:tabs>
@@ -2504,7 +2529,7 @@
           <w:sz w:val="24"/>
           <w:szCs w:val="24"/>
         </w:rPr>
-        <w:t xml:space="preserve"> Cameroon uses the standard time of the meridian 15° E, and New York uses that of the meridian 75° W. Calculate the time in New York when it is 8:00 a.m. in Garoua, showing your working. </w:t>
+        <w:t xml:space="preserve"> Using the size of the Earth, explain to Ali why the land around Garoua looks flat, although the Earth is round. </w:t>
       </w:r>
       <w:r>
         <w:rPr>

</xml_diff>